<commit_message>
agregue el nuevo arbol y aya funciona el shadow
</commit_message>
<xml_diff>
--- a/laboratorio 4/Ayala-Caicedo.docx
+++ b/laboratorio 4/Ayala-Caicedo.docx
@@ -1,6 +1,6 @@
 
 <file path=word/document.xml><?xml version="1.0" encoding="utf-8"?>
-<w:document xmlns:wpc="http://schemas.microsoft.com/office/word/2010/wordprocessingCanvas" xmlns:cx="http://schemas.microsoft.com/office/drawing/2014/chartex" xmlns:cx1="http://schemas.microsoft.com/office/drawing/2015/9/8/chartex" xmlns:cx2="http://schemas.microsoft.com/office/drawing/2015/10/21/chartex" xmlns:cx3="http://schemas.microsoft.com/office/drawing/2016/5/9/chartex" xmlns:cx4="http://schemas.microsoft.com/office/drawing/2016/5/10/chartex" xmlns:cx5="http://schemas.microsoft.com/office/drawing/2016/5/11/chartex" xmlns:cx6="http://schemas.microsoft.com/office/drawing/2016/5/12/chartex" xmlns:cx7="http://schemas.microsoft.com/office/drawing/2016/5/13/chartex" xmlns:cx8="http://schemas.microsoft.com/office/drawing/2016/5/14/chartex" xmlns:mc="http://schemas.openxmlformats.org/markup-compatibility/2006" xmlns:aink="http://schemas.microsoft.com/office/drawing/2016/ink" xmlns:am3d="http://schemas.microsoft.com/office/drawing/2017/model3d" xmlns:o="urn:schemas-microsoft-com:office:office" xmlns:oel="http://schemas.microsoft.com/office/2019/extlst" xmlns:r="http://schemas.openxmlformats.org/officeDocument/2006/relationships" xmlns:m="http://schemas.openxmlformats.org/officeDocument/2006/math" xmlns:v="urn:schemas-microsoft-com:vml" xmlns:wp14="http://schemas.microsoft.com/office/word/2010/wordprocessingDrawing" xmlns:wp="http://schemas.openxmlformats.org/drawingml/2006/wordprocessingDrawing" xmlns:w10="urn:schemas-microsoft-com:office:word" xmlns:w="http://schemas.openxmlformats.org/wordprocessingml/2006/main" xmlns:w14="http://schemas.microsoft.com/office/word/2010/wordml" xmlns:w15="http://schemas.microsoft.com/office/word/2012/wordml" xmlns:w16cex="http://schemas.microsoft.com/office/word/2018/wordml/cex" xmlns:w16cid="http://schemas.microsoft.com/office/word/2016/wordml/cid" xmlns:w16="http://schemas.microsoft.com/office/word/2018/wordml" xmlns:w16du="http://schemas.microsoft.com/office/word/2023/wordml/word16du" xmlns:w16sdtdh="http://schemas.microsoft.com/office/word/2020/wordml/sdtdatahash" xmlns:w16sdtfl="http://schemas.microsoft.com/office/word/2024/wordml/sdtformatlock" xmlns:w16se="http://schemas.microsoft.com/office/word/2015/wordml/symex" xmlns:wpg="http://schemas.microsoft.com/office/word/2010/wordprocessingGroup" xmlns:wpi="http://schemas.microsoft.com/office/word/2010/wordprocessingInk" xmlns:wne="http://schemas.microsoft.com/office/word/2006/wordml" xmlns:wps="http://schemas.microsoft.com/office/word/2010/wordprocessingShape" mc:Ignorable="w14 w15 w16se w16cid w16 w16cex w16sdtdh w16sdtfl w16du wp14">
+<w:document xmlns:wpc="http://schemas.microsoft.com/office/word/2010/wordprocessingCanvas" xmlns:cx="http://schemas.microsoft.com/office/drawing/2014/chartex" xmlns:cx1="http://schemas.microsoft.com/office/drawing/2015/9/8/chartex" xmlns:cx2="http://schemas.microsoft.com/office/drawing/2015/10/21/chartex" xmlns:cx3="http://schemas.microsoft.com/office/drawing/2016/5/9/chartex" xmlns:cx4="http://schemas.microsoft.com/office/drawing/2016/5/10/chartex" xmlns:cx5="http://schemas.microsoft.com/office/drawing/2016/5/11/chartex" xmlns:cx6="http://schemas.microsoft.com/office/drawing/2016/5/12/chartex" xmlns:cx7="http://schemas.microsoft.com/office/drawing/2016/5/13/chartex" xmlns:cx8="http://schemas.microsoft.com/office/drawing/2016/5/14/chartex" xmlns:mc="http://schemas.openxmlformats.org/markup-compatibility/2006" xmlns:aink="http://schemas.microsoft.com/office/drawing/2016/ink" xmlns:am3d="http://schemas.microsoft.com/office/drawing/2017/model3d" xmlns:o="urn:schemas-microsoft-com:office:office" xmlns:r="http://schemas.openxmlformats.org/officeDocument/2006/relationships" xmlns:m="http://schemas.openxmlformats.org/officeDocument/2006/math" xmlns:v="urn:schemas-microsoft-com:vml" xmlns:wp14="http://schemas.microsoft.com/office/word/2010/wordprocessingDrawing" xmlns:wp="http://schemas.openxmlformats.org/drawingml/2006/wordprocessingDrawing" xmlns:w10="urn:schemas-microsoft-com:office:word" xmlns:w="http://schemas.openxmlformats.org/wordprocessingml/2006/main" xmlns:w14="http://schemas.microsoft.com/office/word/2010/wordml" xmlns:w15="http://schemas.microsoft.com/office/word/2012/wordml" xmlns:w16cex="http://schemas.microsoft.com/office/word/2018/wordml/cex" xmlns:w16cid="http://schemas.microsoft.com/office/word/2016/wordml/cid" xmlns:w16="http://schemas.microsoft.com/office/word/2018/wordml" xmlns:w16sdtdh="http://schemas.microsoft.com/office/word/2020/wordml/sdtdatahash" xmlns:w16se="http://schemas.microsoft.com/office/word/2015/wordml/symex" xmlns:wpg="http://schemas.microsoft.com/office/word/2010/wordprocessingGroup" xmlns:wpi="http://schemas.microsoft.com/office/word/2010/wordprocessingInk" xmlns:wne="http://schemas.microsoft.com/office/word/2006/wordml" xmlns:wps="http://schemas.microsoft.com/office/word/2010/wordprocessingShape" mc:Ignorable="w14 w15 w16se w16cid w16 w16cex w16sdtdh wp14">
   <w:body>
     <w:p>
       <w:pPr>
@@ -774,19 +774,7 @@
         <w:rPr>
           <w:lang w:val="es-CO"/>
         </w:rPr>
-        <w:t xml:space="preserve">ca, según lo que buscamos no tiene un nombre como tal técnico pero si se relaciona con el encapsulamiento a nivel de paquete y la cohesión , ahora esto nos sirve para lo siguiente: si a una clase no le agregamos el </w:t>
-      </w:r>
-      <w:r>
-        <w:rPr>
-          <w:lang w:val="es-CO"/>
-        </w:rPr>
-        <w:t>public, private ni protected</w:t>
-      </w:r>
-      <w:r>
-        <w:rPr>
-          <w:lang w:val="es-CO"/>
-        </w:rPr>
-        <w:t xml:space="preserve"> se le agrega uno por default o package.private</w:t>
+        <w:t>ca, según lo que buscamos no tiene un nombre como tal técnico pero si se relaciona con el encapsulamiento a nivel de paquete y la cohesión , ahora esto nos sirve para lo siguiente: si a una clase no le agregamos el public, private ni protected se le agrega uno por default o package.private</w:t>
       </w:r>
       <w:r>
         <w:rPr>
@@ -814,23 +802,7 @@
           <w:sz w:val="24"/>
           <w:lang w:val="es-CO"/>
         </w:rPr>
-        <w:t>Adicione la clase de pruebas necesaria para BDD en un paquete independiente de test. (No lo</w:t>
-      </w:r>
-      <w:r>
-        <w:rPr>
-          <w:bCs/>
-          <w:sz w:val="24"/>
-          <w:lang w:val="es-CO"/>
-        </w:rPr>
-        <w:t xml:space="preserve"> </w:t>
-      </w:r>
-      <w:r>
-        <w:rPr>
-          <w:bCs/>
-          <w:sz w:val="24"/>
-          <w:lang w:val="es-CO"/>
-        </w:rPr>
-        <w:t>adicione al diagrama de clases) (a) ¿Qué clase debe importar? (b) ¿Por qué?</w:t>
+        <w:t>Adicione la clase de pruebas necesaria para BDD en un paquete independiente de test. (No lo adicione al diagrama de clases) (a) ¿Qué clase debe importar? (b) ¿Por qué?</w:t>
       </w:r>
     </w:p>
     <w:p>
@@ -950,55 +922,7 @@
           <w:sz w:val="24"/>
           <w:lang w:val="es-CO"/>
         </w:rPr>
-        <w:t>Estudie la clase Forest . (a) ¿Qué tipo de colección usa para albergar cosas?</w:t>
-      </w:r>
-      <w:r>
-        <w:rPr>
-          <w:bCs/>
-          <w:sz w:val="24"/>
-          <w:lang w:val="es-CO"/>
-        </w:rPr>
-        <w:t xml:space="preserve"> </w:t>
-      </w:r>
-      <w:r>
-        <w:rPr>
-          <w:bCs/>
-          <w:sz w:val="24"/>
-          <w:lang w:val="es-CO"/>
-        </w:rPr>
-        <w:t>(b)¿Pued</w:t>
-      </w:r>
-      <w:r>
-        <w:rPr>
-          <w:bCs/>
-          <w:sz w:val="24"/>
-          <w:lang w:val="es-CO"/>
-        </w:rPr>
-        <w:t xml:space="preserve">e </w:t>
-      </w:r>
-      <w:r>
-        <w:rPr>
-          <w:bCs/>
-          <w:sz w:val="24"/>
-          <w:lang w:val="es-CO"/>
-        </w:rPr>
-        <w:t>tener</w:t>
-      </w:r>
-      <w:r>
-        <w:rPr>
-          <w:bCs/>
-          <w:sz w:val="24"/>
-          <w:lang w:val="es-CO"/>
-        </w:rPr>
-        <w:t xml:space="preserve"> </w:t>
-      </w:r>
-      <w:r>
-        <w:rPr>
-          <w:bCs/>
-          <w:sz w:val="24"/>
-          <w:lang w:val="es-CO"/>
-        </w:rPr>
-        <w:t>árboles ? (c) ¿Por qué?</w:t>
+        <w:t>Estudie la clase Forest . (a) ¿Qué tipo de colección usa para albergar cosas? (b)¿Puede tener árboles ? (c) ¿Por qué?</w:t>
       </w:r>
     </w:p>
     <w:p>
@@ -1102,39 +1026,7 @@
           <w:sz w:val="24"/>
           <w:lang w:val="es-CO"/>
         </w:rPr>
-        <w:t xml:space="preserve"> Estudie el código asociado a la clase Tree , (a) ¿de qué color es? (b) ¿qué forma usa para pintarse? (c) ¿cuándo cambia de color ? (d) ¿qué componentes definen la clase Tree ? Justifique</w:t>
-      </w:r>
-      <w:r>
-        <w:rPr>
-          <w:bCs/>
-          <w:sz w:val="24"/>
-          <w:lang w:val="es-CO"/>
-        </w:rPr>
-        <w:t xml:space="preserve"> </w:t>
-      </w:r>
-      <w:r>
-        <w:rPr>
-          <w:bCs/>
-          <w:sz w:val="24"/>
-          <w:lang w:val="es-CO"/>
-        </w:rPr>
-        <w:t>sus</w:t>
-      </w:r>
-      <w:r>
-        <w:rPr>
-          <w:bCs/>
-          <w:sz w:val="24"/>
-          <w:lang w:val="es-CO"/>
-        </w:rPr>
-        <w:t xml:space="preserve"> </w:t>
-      </w:r>
-      <w:r>
-        <w:rPr>
-          <w:bCs/>
-          <w:sz w:val="24"/>
-          <w:lang w:val="es-CO"/>
-        </w:rPr>
-        <w:t>respuestas.</w:t>
+        <w:t xml:space="preserve"> Estudie el código asociado a la clase Tree , (a) ¿de qué color es? (b) ¿qué forma usa para pintarse? (c) ¿cuándo cambia de color ? (d) ¿qué componentes definen la clase Tree ? Justifique sus respuestas.</w:t>
       </w:r>
     </w:p>
     <w:p>
@@ -1444,138 +1336,139 @@
           <w:szCs w:val="24"/>
           <w:lang w:val="es-CO"/>
         </w:rPr>
-        <w:t>a</w:t>
-      </w:r>
-      <w:r>
+        <w:t>atributos propios: row, column, forest, color, season y tictac.</w:t>
+      </w:r>
+    </w:p>
+    <w:p>
+      <w:pPr>
+        <w:ind w:left="1080"/>
         <w:rPr>
           <w:rFonts w:cstheme="minorHAnsi"/>
           <w:sz w:val="24"/>
           <w:szCs w:val="24"/>
           <w:lang w:val="es-CO"/>
         </w:rPr>
-        <w:t>tributos propios: row, column, forest, color, season y tictac.</w:t>
-      </w:r>
-    </w:p>
-    <w:p>
-      <w:pPr>
+      </w:pPr>
+      <w:r>
+        <w:rPr>
+          <w:rFonts w:cstheme="minorHAnsi"/>
+          <w:sz w:val="24"/>
+          <w:szCs w:val="24"/>
+          <w:lang w:val="es-CO"/>
+        </w:rPr>
+        <w:t xml:space="preserve">b) </w:t>
+      </w:r>
+      <w:r>
+        <w:rPr>
+          <w:rFonts w:cstheme="minorHAnsi"/>
+          <w:lang w:val="es-CO"/>
+        </w:rPr>
+        <w:t>Tree puede ejecutar todos los métodos definidos en LivingThing:</w:t>
+      </w:r>
+      <w:r>
+        <w:rPr>
+          <w:rFonts w:cstheme="minorHAnsi"/>
+          <w:lang w:val="es-CO"/>
+        </w:rPr>
+        <w:br/>
+      </w:r>
+      <w:r>
+        <w:rPr>
+          <w:rFonts w:cstheme="minorHAnsi"/>
+          <w:sz w:val="24"/>
+          <w:szCs w:val="24"/>
+          <w:lang w:val="es-CO"/>
+        </w:rPr>
+        <w:t xml:space="preserve">              </w:t>
+      </w:r>
+      <w:r>
+        <w:rPr>
+          <w:rFonts w:cstheme="minorHAnsi"/>
+          <w:sz w:val="24"/>
+          <w:szCs w:val="24"/>
+          <w:lang w:val="es-CO"/>
+        </w:rPr>
+        <w:t>getAge(): Para consultar cuántos años ha vivido.</w:t>
+      </w:r>
+    </w:p>
+    <w:p>
+      <w:pPr>
+        <w:ind w:left="1800"/>
+        <w:rPr>
+          <w:rFonts w:cstheme="minorHAnsi"/>
+          <w:sz w:val="24"/>
+          <w:szCs w:val="24"/>
+          <w:lang w:val="es-CO"/>
+        </w:rPr>
+      </w:pPr>
+      <w:r>
+        <w:rPr>
+          <w:rFonts w:cstheme="minorHAnsi"/>
+          <w:sz w:val="24"/>
+          <w:szCs w:val="24"/>
+          <w:lang w:val="es-CO"/>
+        </w:rPr>
+        <w:t>isAlive(): Para verificar su estado de salud.</w:t>
+      </w:r>
+    </w:p>
+    <w:p>
+      <w:pPr>
+        <w:ind w:left="1800"/>
+        <w:rPr>
+          <w:rFonts w:cstheme="minorHAnsi"/>
+          <w:sz w:val="24"/>
+          <w:szCs w:val="24"/>
+          <w:lang w:val="es-CO"/>
+        </w:rPr>
+      </w:pPr>
+      <w:r>
+        <w:rPr>
+          <w:rFonts w:cstheme="minorHAnsi"/>
+          <w:sz w:val="24"/>
+          <w:szCs w:val="24"/>
+          <w:lang w:val="es-CO"/>
+        </w:rPr>
+        <w:t>die(): Aunque Tree tiene su propia implementación para removerse del bosque, hereda la lógica base de "morir" (cambiar el estado).</w:t>
+      </w:r>
+    </w:p>
+    <w:p>
+      <w:pPr>
+        <w:ind w:left="1800"/>
+        <w:rPr>
+          <w:rFonts w:cstheme="minorHAnsi"/>
+          <w:sz w:val="24"/>
+          <w:szCs w:val="24"/>
+          <w:lang w:val="es-CO"/>
+        </w:rPr>
+      </w:pPr>
+      <w:r>
+        <w:rPr>
+          <w:rFonts w:cstheme="minorHAnsi"/>
+          <w:sz w:val="24"/>
+          <w:szCs w:val="24"/>
+          <w:lang w:val="es-CO"/>
+        </w:rPr>
+        <w:t>step(): Un método que define una acción biológica básica (mencionado en el if del ticTac).</w:t>
+      </w:r>
+    </w:p>
+    <w:p>
+      <w:pPr>
+        <w:pStyle w:val="Prrafodelista"/>
+        <w:ind w:left="1440"/>
+        <w:rPr>
+          <w:rFonts w:cstheme="minorHAnsi"/>
+          <w:sz w:val="24"/>
+          <w:szCs w:val="24"/>
+          <w:lang w:val="es-CO"/>
+        </w:rPr>
+      </w:pPr>
+    </w:p>
+    <w:p>
+      <w:pPr>
+        <w:pStyle w:val="Prrafodelista"/>
         <w:ind w:left="1080"/>
         <w:rPr>
           <w:rFonts w:cstheme="minorHAnsi"/>
-          <w:sz w:val="24"/>
-          <w:szCs w:val="24"/>
-          <w:lang w:val="es-CO"/>
-        </w:rPr>
-      </w:pPr>
-      <w:r>
-        <w:rPr>
-          <w:rFonts w:cstheme="minorHAnsi"/>
-          <w:sz w:val="24"/>
-          <w:szCs w:val="24"/>
-          <w:lang w:val="es-CO"/>
-        </w:rPr>
-        <w:t xml:space="preserve">b) </w:t>
-      </w:r>
-      <w:r>
-        <w:rPr>
-          <w:rFonts w:cstheme="minorHAnsi"/>
-          <w:lang w:val="es-CO"/>
-        </w:rPr>
-        <w:t>Tree puede ejecutar todos los métodos definidos en LivingThing:</w:t>
-      </w:r>
-      <w:r>
-        <w:rPr>
-          <w:rFonts w:cstheme="minorHAnsi"/>
-          <w:lang w:val="es-CO"/>
-        </w:rPr>
-        <w:br/>
-      </w:r>
-      <w:r>
-        <w:rPr>
-          <w:rFonts w:cstheme="minorHAnsi"/>
-          <w:sz w:val="24"/>
-          <w:szCs w:val="24"/>
-          <w:lang w:val="es-CO"/>
-        </w:rPr>
-        <w:t xml:space="preserve">              </w:t>
-      </w:r>
-      <w:r>
-        <w:rPr>
-          <w:rFonts w:cstheme="minorHAnsi"/>
-          <w:sz w:val="24"/>
-          <w:szCs w:val="24"/>
-          <w:lang w:val="es-CO"/>
-        </w:rPr>
-        <w:t>getAge(): Para consultar cuántos años ha vivido.</w:t>
-      </w:r>
-    </w:p>
-    <w:p>
-      <w:pPr>
-        <w:ind w:left="1800"/>
-        <w:rPr>
-          <w:rFonts w:cstheme="minorHAnsi"/>
-          <w:sz w:val="24"/>
-          <w:szCs w:val="24"/>
-          <w:lang w:val="es-CO"/>
-        </w:rPr>
-      </w:pPr>
-      <w:r>
-        <w:rPr>
-          <w:rFonts w:cstheme="minorHAnsi"/>
-          <w:sz w:val="24"/>
-          <w:szCs w:val="24"/>
-          <w:lang w:val="es-CO"/>
-        </w:rPr>
-        <w:t>isAlive(): Para verificar su estado de salud.</w:t>
-      </w:r>
-    </w:p>
-    <w:p>
-      <w:pPr>
-        <w:ind w:left="1800"/>
-        <w:rPr>
-          <w:rFonts w:cstheme="minorHAnsi"/>
-          <w:sz w:val="24"/>
-          <w:szCs w:val="24"/>
-          <w:lang w:val="es-CO"/>
-        </w:rPr>
-      </w:pPr>
-      <w:r>
-        <w:rPr>
-          <w:rFonts w:cstheme="minorHAnsi"/>
-          <w:sz w:val="24"/>
-          <w:szCs w:val="24"/>
-          <w:lang w:val="es-CO"/>
-        </w:rPr>
-        <w:t>die(): Aunque Tree tiene su propia implementación para removerse del bosque, hereda la lógica base de "morir" (cambiar el estado).</w:t>
-      </w:r>
-    </w:p>
-    <w:p>
-      <w:pPr>
-        <w:ind w:left="1800"/>
-        <w:rPr>
-          <w:rFonts w:cstheme="minorHAnsi"/>
-          <w:sz w:val="24"/>
-          <w:szCs w:val="24"/>
-          <w:lang w:val="es-CO"/>
-        </w:rPr>
-      </w:pPr>
-      <w:r>
-        <w:rPr>
-          <w:rFonts w:cstheme="minorHAnsi"/>
-          <w:sz w:val="24"/>
-          <w:szCs w:val="24"/>
-          <w:lang w:val="es-CO"/>
-        </w:rPr>
-        <w:t>step(): Un método que define una acción biológica básica (mencionado en el if del ticTac).</w:t>
-      </w:r>
-    </w:p>
-    <w:p>
-      <w:pPr>
-        <w:pStyle w:val="Prrafodelista"/>
-        <w:ind w:left="1440"/>
-        <w:rPr>
-          <w:rFonts w:cstheme="minorHAnsi"/>
-          <w:sz w:val="24"/>
-          <w:szCs w:val="24"/>
           <w:lang w:val="es-CO"/>
         </w:rPr>
       </w:pPr>
@@ -1589,6 +1482,27 @@
           <w:lang w:val="es-CO"/>
         </w:rPr>
       </w:pPr>
+      <w:r>
+        <w:rPr>
+          <w:rFonts w:cstheme="minorHAnsi"/>
+          <w:lang w:val="es-CO"/>
+        </w:rPr>
+        <w:t>c)</w:t>
+      </w:r>
+      <w:r>
+        <w:rPr>
+          <w:rFonts w:cstheme="minorHAnsi"/>
+          <w:lang w:val="es-CO"/>
+        </w:rPr>
+        <w:t xml:space="preserve">  respecto a living tree no sobre e</w:t>
+      </w:r>
+      <w:r>
+        <w:rPr>
+          <w:rFonts w:cstheme="minorHAnsi"/>
+          <w:lang w:val="es-CO"/>
+        </w:rPr>
+        <w:t>scribe nada, ya que todos los métodos son final</w:t>
+      </w:r>
     </w:p>
     <w:p>
       <w:pPr>
@@ -1599,27 +1513,6 @@
           <w:lang w:val="es-CO"/>
         </w:rPr>
       </w:pPr>
-      <w:r>
-        <w:rPr>
-          <w:rFonts w:cstheme="minorHAnsi"/>
-          <w:lang w:val="es-CO"/>
-        </w:rPr>
-        <w:t>c)</w:t>
-      </w:r>
-      <w:r>
-        <w:rPr>
-          <w:rFonts w:cstheme="minorHAnsi"/>
-          <w:lang w:val="es-CO"/>
-        </w:rPr>
-        <w:t xml:space="preserve">  respecto a living tree no sobre e</w:t>
-      </w:r>
-      <w:r>
-        <w:rPr>
-          <w:rFonts w:cstheme="minorHAnsi"/>
-          <w:lang w:val="es-CO"/>
-        </w:rPr>
-        <w:t>scribe nada, ya que todos los métodos son final</w:t>
-      </w:r>
     </w:p>
     <w:p>
       <w:pPr>
@@ -1627,21 +1520,13 @@
         <w:ind w:left="1080"/>
         <w:rPr>
           <w:rFonts w:cstheme="minorHAnsi"/>
-          <w:lang w:val="es-CO"/>
-        </w:rPr>
-      </w:pPr>
-    </w:p>
-    <w:p>
-      <w:pPr>
-        <w:pStyle w:val="Prrafodelista"/>
-        <w:ind w:left="1080"/>
-        <w:rPr>
-          <w:rFonts w:cstheme="minorHAnsi"/>
-        </w:rPr>
-      </w:pPr>
-      <w:r>
-        <w:rPr>
-          <w:rFonts w:cstheme="minorHAnsi"/>
+          <w:lang w:val="es-ES"/>
+        </w:rPr>
+      </w:pPr>
+      <w:r>
+        <w:rPr>
+          <w:rFonts w:cstheme="minorHAnsi"/>
+          <w:lang w:val="es-ES"/>
         </w:rPr>
         <w:t>d) step(),getEnergy(),isLivingThing()</w:t>
       </w:r>
@@ -1968,6 +1853,7 @@
       <w:r>
         <w:rPr>
           <w:rFonts w:cstheme="minorHAnsi"/>
+          <w:noProof/>
           <w:lang w:val="es-CO"/>
         </w:rPr>
         <w:drawing>
@@ -2104,6 +1990,7 @@
       <w:r>
         <w:rPr>
           <w:rFonts w:cstheme="minorHAnsi"/>
+          <w:noProof/>
           <w:sz w:val="24"/>
           <w:szCs w:val="24"/>
           <w:lang w:val="es-CO"/>
@@ -2217,6 +2104,7 @@
       <w:r>
         <w:rPr>
           <w:rFonts w:cstheme="minorHAnsi"/>
+          <w:noProof/>
           <w:sz w:val="24"/>
           <w:szCs w:val="24"/>
           <w:lang w:val="es-CO"/>
@@ -2305,6 +2193,7 @@
       <w:r>
         <w:rPr>
           <w:rFonts w:cstheme="minorHAnsi"/>
+          <w:noProof/>
           <w:sz w:val="24"/>
           <w:szCs w:val="24"/>
           <w:lang w:val="es-CO"/>
@@ -2460,6 +2349,7 @@
       </w:pPr>
       <w:r>
         <w:rPr>
+          <w:noProof/>
           <w:sz w:val="24"/>
           <w:lang w:val="es-CO"/>
         </w:rPr>
@@ -2535,6 +2425,7 @@
       </w:pPr>
       <w:r>
         <w:rPr>
+          <w:noProof/>
           <w:sz w:val="24"/>
           <w:lang w:val="es-CO"/>
         </w:rPr>
@@ -2714,6 +2605,7 @@
       </w:pPr>
       <w:r>
         <w:rPr>
+          <w:noProof/>
           <w:sz w:val="24"/>
         </w:rPr>
         <w:drawing>
@@ -2872,6 +2764,7 @@
       </w:pPr>
       <w:r>
         <w:rPr>
+          <w:noProof/>
           <w:sz w:val="24"/>
         </w:rPr>
         <w:drawing>
@@ -3099,6 +2992,7 @@
       </w:pPr>
       <w:r>
         <w:rPr>
+          <w:noProof/>
           <w:sz w:val="24"/>
         </w:rPr>
         <w:drawing>
@@ -3153,30 +3047,907 @@
         <w:ind w:hanging="1429"/>
         <w:rPr>
           <w:sz w:val="24"/>
-        </w:rPr>
-      </w:pPr>
-    </w:p>
-    <w:p>
-      <w:pPr>
-        <w:rPr>
-          <w:sz w:val="24"/>
-        </w:rPr>
-      </w:pPr>
-    </w:p>
-    <w:p>
-      <w:pPr>
-        <w:rPr>
-          <w:sz w:val="24"/>
-        </w:rPr>
-      </w:pPr>
-      <w:r>
-        <w:rPr>
-          <w:sz w:val="24"/>
+          <w:lang w:val="es-ES"/>
+        </w:rPr>
+      </w:pPr>
+      <w:r>
+        <w:rPr>
+          <w:b/>
+          <w:bCs/>
+          <w:sz w:val="24"/>
+          <w:lang w:val="es-ES"/>
+        </w:rPr>
+        <w:t>B Ciclo 2. Incluyendo ardillas</w:t>
+      </w:r>
+    </w:p>
+    <w:p>
+      <w:pPr>
+        <w:pStyle w:val="Prrafodelista"/>
+        <w:rPr>
+          <w:sz w:val="24"/>
+          <w:lang w:val="es-ES"/>
+        </w:rPr>
+      </w:pPr>
+      <w:r>
+        <w:rPr>
+          <w:sz w:val="24"/>
+          <w:lang w:val="es-ES"/>
+        </w:rPr>
+        <w:t>El objetivo de este punto es permitir tener ardillas en el bosque. Ellas (i) son cafés y a medida que pasan</w:t>
+      </w:r>
+      <w:r>
+        <w:rPr>
+          <w:sz w:val="24"/>
+          <w:lang w:val="es-ES"/>
         </w:rPr>
         <w:t xml:space="preserve"> </w:t>
       </w:r>
-    </w:p>
-    <w:p/>
+      <w:r>
+        <w:rPr>
+          <w:sz w:val="24"/>
+          <w:lang w:val="es-ES"/>
+        </w:rPr>
+        <w:t>los años se van tornando amarillentas, (ii) después de 10 años mueren, (iii) si quedan dos vecinas con</w:t>
+      </w:r>
+      <w:r>
+        <w:rPr>
+          <w:sz w:val="24"/>
+          <w:lang w:val="es-ES"/>
+        </w:rPr>
+        <w:t xml:space="preserve"> </w:t>
+      </w:r>
+      <w:r>
+        <w:rPr>
+          <w:sz w:val="24"/>
+          <w:lang w:val="es-ES"/>
+        </w:rPr>
+        <w:t>una celda intermedia vacia, allí nace una nueva ardilla, (iv) se mueven aleatoriamente por el bosque</w:t>
+      </w:r>
+    </w:p>
+    <w:p>
+      <w:pPr>
+        <w:pStyle w:val="Prrafodelista"/>
+        <w:numPr>
+          <w:ilvl w:val="0"/>
+          <w:numId w:val="10"/>
+        </w:numPr>
+        <w:rPr>
+          <w:sz w:val="24"/>
+          <w:lang w:val="es-ES"/>
+        </w:rPr>
+      </w:pPr>
+      <w:r>
+        <w:rPr>
+          <w:sz w:val="24"/>
+          <w:lang w:val="es-ES"/>
+        </w:rPr>
+        <w:lastRenderedPageBreak/>
+        <w:t>Para implementar esta nueva LivingThing (a) ¿cuáles métodos se sobre-escriben (overriding)?</w:t>
+      </w:r>
+    </w:p>
+    <w:p>
+      <w:pPr>
+        <w:pStyle w:val="Prrafodelista"/>
+        <w:rPr>
+          <w:sz w:val="24"/>
+          <w:lang w:val="es-ES"/>
+        </w:rPr>
+      </w:pPr>
+      <w:r>
+        <w:rPr>
+          <w:sz w:val="24"/>
+          <w:lang w:val="es-ES"/>
+        </w:rPr>
+        <w:t>Se realizó overriding en tictac y en shape sobre ser un Thing, en cuando a los métodos de Living thing, se sobreescribió el die().</w:t>
+      </w:r>
+    </w:p>
+    <w:p>
+      <w:pPr>
+        <w:pStyle w:val="Prrafodelista"/>
+        <w:rPr>
+          <w:sz w:val="24"/>
+          <w:lang w:val="es-ES"/>
+        </w:rPr>
+      </w:pPr>
+    </w:p>
+    <w:p>
+      <w:pPr>
+        <w:pStyle w:val="Prrafodelista"/>
+        <w:numPr>
+          <w:ilvl w:val="0"/>
+          <w:numId w:val="10"/>
+        </w:numPr>
+        <w:rPr>
+          <w:sz w:val="24"/>
+          <w:lang w:val="es-ES"/>
+        </w:rPr>
+      </w:pPr>
+      <w:r>
+        <w:rPr>
+          <w:sz w:val="24"/>
+          <w:lang w:val="es-ES"/>
+        </w:rPr>
+        <w:t>Diseñen, construyan y prueben esta nueva clase. (Mínimo dos pruebas de unidad)</w:t>
+      </w:r>
+    </w:p>
+    <w:p>
+      <w:pPr>
+        <w:pStyle w:val="Prrafodelista"/>
+        <w:rPr>
+          <w:sz w:val="24"/>
+          <w:lang w:val="es-ES"/>
+        </w:rPr>
+      </w:pPr>
+    </w:p>
+    <w:p>
+      <w:pPr>
+        <w:pStyle w:val="Prrafodelista"/>
+        <w:rPr>
+          <w:sz w:val="24"/>
+          <w:lang w:val="es-ES"/>
+        </w:rPr>
+      </w:pPr>
+    </w:p>
+    <w:p>
+      <w:pPr>
+        <w:pStyle w:val="Prrafodelista"/>
+        <w:numPr>
+          <w:ilvl w:val="0"/>
+          <w:numId w:val="10"/>
+        </w:numPr>
+        <w:rPr>
+          <w:sz w:val="24"/>
+        </w:rPr>
+      </w:pPr>
+      <w:r>
+        <w:rPr>
+          <w:sz w:val="24"/>
+          <w:lang w:val="es-ES"/>
+        </w:rPr>
+        <w:t>Adicione una pareja de ardillas , de nombre scrat y sandy , (a) ¿Cómo quedarían después de 5</w:t>
+      </w:r>
+      <w:r>
+        <w:rPr>
+          <w:sz w:val="24"/>
+          <w:lang w:val="es-ES"/>
+        </w:rPr>
+        <w:t xml:space="preserve"> </w:t>
+      </w:r>
+      <w:r>
+        <w:rPr>
+          <w:sz w:val="24"/>
+          <w:lang w:val="es-ES"/>
+        </w:rPr>
+        <w:t xml:space="preserve">Tic-tac? Ejecuten el programa y hagan 5 clics en el botón. Capturen una pantalla </w:t>
+      </w:r>
+      <w:r>
+        <w:rPr>
+          <w:sz w:val="24"/>
+          <w:lang w:val="es-ES"/>
+        </w:rPr>
+        <w:t xml:space="preserve"> s</w:t>
+      </w:r>
+      <w:r>
+        <w:rPr>
+          <w:sz w:val="24"/>
+          <w:lang w:val="es-ES"/>
+        </w:rPr>
+        <w:t>ignificativa. (b</w:t>
+      </w:r>
+      <w:r>
+        <w:rPr>
+          <w:sz w:val="24"/>
+          <w:lang w:val="es-ES"/>
+        </w:rPr>
+        <w:t xml:space="preserve">) </w:t>
+      </w:r>
+      <w:r>
+        <w:rPr>
+          <w:sz w:val="24"/>
+        </w:rPr>
+        <w:t>¿Es correcto?</w:t>
+      </w:r>
+    </w:p>
+    <w:p>
+      <w:pPr>
+        <w:pStyle w:val="Prrafodelista"/>
+        <w:rPr>
+          <w:sz w:val="24"/>
+          <w:lang w:val="es-ES"/>
+        </w:rPr>
+      </w:pPr>
+      <w:r>
+        <w:rPr>
+          <w:sz w:val="24"/>
+          <w:lang w:val="es-ES"/>
+        </w:rPr>
+        <w:t>b. es correcto debido a</w:t>
+      </w:r>
+      <w:r>
+        <w:rPr>
+          <w:sz w:val="24"/>
+          <w:lang w:val="es-ES"/>
+        </w:rPr>
+        <w:t xml:space="preserve"> que se reprodujeron 3 veces</w:t>
+      </w:r>
+    </w:p>
+    <w:p>
+      <w:pPr>
+        <w:pStyle w:val="Prrafodelista"/>
+        <w:rPr>
+          <w:sz w:val="24"/>
+        </w:rPr>
+      </w:pPr>
+      <w:r>
+        <w:rPr>
+          <w:sz w:val="24"/>
+        </w:rPr>
+        <w:drawing>
+          <wp:inline distT="0" distB="0" distL="0" distR="0" wp14:anchorId="2CA7A377" wp14:editId="05611E86">
+            <wp:extent cx="4831725" cy="3742006"/>
+            <wp:effectExtent l="0" t="0" r="6985" b="0"/>
+            <wp:docPr id="2" name="Imagen 2"/>
+            <wp:cNvGraphicFramePr>
+              <a:graphicFrameLocks xmlns:a="http://schemas.openxmlformats.org/drawingml/2006/main" noChangeAspect="1"/>
+            </wp:cNvGraphicFramePr>
+            <a:graphic xmlns:a="http://schemas.openxmlformats.org/drawingml/2006/main">
+              <a:graphicData uri="http://schemas.openxmlformats.org/drawingml/2006/picture">
+                <pic:pic xmlns:pic="http://schemas.openxmlformats.org/drawingml/2006/picture">
+                  <pic:nvPicPr>
+                    <pic:cNvPr id="1" name=""/>
+                    <pic:cNvPicPr/>
+                  </pic:nvPicPr>
+                  <pic:blipFill>
+                    <a:blip r:embed="rId13"/>
+                    <a:stretch>
+                      <a:fillRect/>
+                    </a:stretch>
+                  </pic:blipFill>
+                  <pic:spPr>
+                    <a:xfrm>
+                      <a:off x="0" y="0"/>
+                      <a:ext cx="4835533" cy="3744955"/>
+                    </a:xfrm>
+                    <a:prstGeom prst="rect">
+                      <a:avLst/>
+                    </a:prstGeom>
+                  </pic:spPr>
+                </pic:pic>
+              </a:graphicData>
+            </a:graphic>
+          </wp:inline>
+        </w:drawing>
+      </w:r>
+    </w:p>
+    <w:p>
+      <w:pPr>
+        <w:pStyle w:val="Prrafodelista"/>
+        <w:rPr>
+          <w:sz w:val="24"/>
+        </w:rPr>
+      </w:pPr>
+    </w:p>
+    <w:p>
+      <w:pPr>
+        <w:pStyle w:val="Prrafodelista"/>
+        <w:rPr>
+          <w:sz w:val="24"/>
+          <w:lang w:val="es-ES"/>
+        </w:rPr>
+      </w:pPr>
+      <w:r>
+        <w:rPr>
+          <w:b/>
+          <w:bCs/>
+          <w:sz w:val="24"/>
+          <w:lang w:val="es-ES"/>
+        </w:rPr>
+        <w:t>C Ciclo 3. Adicionando sombras</w:t>
+      </w:r>
+      <w:r>
+        <w:rPr>
+          <w:sz w:val="24"/>
+          <w:lang w:val="es-ES"/>
+        </w:rPr>
+        <w:t xml:space="preserve"> </w:t>
+      </w:r>
+    </w:p>
+    <w:p>
+      <w:pPr>
+        <w:pStyle w:val="Prrafodelista"/>
+        <w:rPr>
+          <w:sz w:val="24"/>
+          <w:lang w:val="es-ES"/>
+        </w:rPr>
+      </w:pPr>
+      <w:r>
+        <w:rPr>
+          <w:sz w:val="24"/>
+          <w:lang w:val="es-ES"/>
+        </w:rPr>
+        <w:t>El objetivo de este punto es incluir sombras (sólo vamos a permitir el tipo básico). Ellas (i) son puntos</w:t>
+      </w:r>
+      <w:r>
+        <w:rPr>
+          <w:sz w:val="24"/>
+          <w:lang w:val="es-ES"/>
+        </w:rPr>
+        <w:t xml:space="preserve"> </w:t>
+      </w:r>
+      <w:r>
+        <w:rPr>
+          <w:sz w:val="24"/>
+          <w:lang w:val="es-ES"/>
+        </w:rPr>
+        <w:t>negros que exparcen su sombra en toda la fila en la que se encuentran, (ii) se desplazan de sur a norte</w:t>
+      </w:r>
+      <w:r>
+        <w:rPr>
+          <w:sz w:val="24"/>
+          <w:lang w:val="es-ES"/>
+        </w:rPr>
+        <w:t xml:space="preserve"> </w:t>
+      </w:r>
+      <w:r>
+        <w:rPr>
+          <w:sz w:val="24"/>
+          <w:lang w:val="es-ES"/>
+        </w:rPr>
+        <w:t>circularmente</w:t>
+      </w:r>
+    </w:p>
+    <w:p>
+      <w:pPr>
+        <w:pStyle w:val="Prrafodelista"/>
+        <w:numPr>
+          <w:ilvl w:val="0"/>
+          <w:numId w:val="11"/>
+        </w:numPr>
+        <w:rPr>
+          <w:sz w:val="24"/>
+          <w:lang w:val="es-ES"/>
+        </w:rPr>
+      </w:pPr>
+      <w:r>
+        <w:rPr>
+          <w:sz w:val="24"/>
+          <w:lang w:val="es-ES"/>
+        </w:rPr>
+        <w:t>Para poder adicionar sombras, (a) ¿debe cambiar en el código de Forest en algo? (b) ¿por qué?</w:t>
+      </w:r>
+      <w:r>
+        <w:rPr>
+          <w:sz w:val="24"/>
+          <w:lang w:val="es-ES"/>
+        </w:rPr>
+        <w:t xml:space="preserve"> </w:t>
+      </w:r>
+      <w:r>
+        <w:rPr>
+          <w:sz w:val="24"/>
+          <w:lang w:val="es-ES"/>
+        </w:rPr>
+        <w:t>(c) ¿debe extender Thing? (d) ¿por qué?</w:t>
+      </w:r>
+    </w:p>
+    <w:p>
+      <w:pPr>
+        <w:rPr>
+          <w:sz w:val="24"/>
+          <w:lang w:val="es-ES"/>
+        </w:rPr>
+      </w:pPr>
+    </w:p>
+    <w:p>
+      <w:pPr>
+        <w:pStyle w:val="font-claude-response-body"/>
+        <w:ind w:firstLine="360"/>
+        <w:rPr>
+          <w:rFonts w:asciiTheme="minorHAnsi" w:eastAsiaTheme="minorHAnsi" w:hAnsiTheme="minorHAnsi" w:cstheme="minorBidi"/>
+          <w:szCs w:val="22"/>
+          <w:lang w:eastAsia="en-US"/>
+        </w:rPr>
+      </w:pPr>
+      <w:r>
+        <w:rPr>
+          <w:rFonts w:asciiTheme="minorHAnsi" w:eastAsiaTheme="minorHAnsi" w:hAnsiTheme="minorHAnsi" w:cstheme="minorBidi"/>
+          <w:szCs w:val="22"/>
+          <w:lang w:eastAsia="en-US"/>
+        </w:rPr>
+        <w:lastRenderedPageBreak/>
+        <w:t xml:space="preserve">Rta.a: </w:t>
+      </w:r>
+      <w:r>
+        <w:rPr>
+          <w:rFonts w:asciiTheme="minorHAnsi" w:eastAsiaTheme="minorHAnsi" w:hAnsiTheme="minorHAnsi" w:cstheme="minorBidi"/>
+          <w:szCs w:val="22"/>
+          <w:lang w:eastAsia="en-US"/>
+        </w:rPr>
+        <w:t>Sí</w:t>
+      </w:r>
+      <w:r>
+        <w:rPr>
+          <w:rFonts w:asciiTheme="minorHAnsi" w:eastAsiaTheme="minorHAnsi" w:hAnsiTheme="minorHAnsi" w:cstheme="minorBidi"/>
+          <w:szCs w:val="22"/>
+          <w:lang w:eastAsia="en-US"/>
+        </w:rPr>
+        <w:t>, s</w:t>
+      </w:r>
+      <w:r>
+        <w:rPr>
+          <w:rFonts w:asciiTheme="minorHAnsi" w:eastAsiaTheme="minorHAnsi" w:hAnsiTheme="minorHAnsi" w:cstheme="minorBidi"/>
+          <w:szCs w:val="22"/>
+          <w:lang w:eastAsia="en-US"/>
+        </w:rPr>
+        <w:t xml:space="preserve">e </w:t>
+      </w:r>
+      <w:r>
+        <w:rPr>
+          <w:rFonts w:asciiTheme="minorHAnsi" w:eastAsiaTheme="minorHAnsi" w:hAnsiTheme="minorHAnsi" w:cstheme="minorBidi"/>
+          <w:szCs w:val="22"/>
+          <w:lang w:eastAsia="en-US"/>
+        </w:rPr>
+        <w:t>agregó:</w:t>
+      </w:r>
+    </w:p>
+    <w:p>
+      <w:pPr>
+        <w:pStyle w:val="whitespace-normal"/>
+        <w:ind w:left="720"/>
+        <w:rPr>
+          <w:rFonts w:asciiTheme="minorHAnsi" w:eastAsiaTheme="minorHAnsi" w:hAnsiTheme="minorHAnsi" w:cstheme="minorBidi"/>
+          <w:szCs w:val="22"/>
+          <w:lang w:eastAsia="en-US"/>
+        </w:rPr>
+      </w:pPr>
+      <w:r>
+        <w:rPr>
+          <w:rFonts w:asciiTheme="minorHAnsi" w:eastAsiaTheme="minorHAnsi" w:hAnsiTheme="minorHAnsi" w:cstheme="minorBidi"/>
+          <w:szCs w:val="22"/>
+          <w:lang w:eastAsia="en-US"/>
+        </w:rPr>
+        <w:t>Agregar una lista List&lt;Shadow&gt; shadows separada de places[][]</w:t>
+      </w:r>
+      <w:r>
+        <w:rPr>
+          <w:rFonts w:asciiTheme="minorHAnsi" w:eastAsiaTheme="minorHAnsi" w:hAnsiTheme="minorHAnsi" w:cstheme="minorBidi"/>
+          <w:szCs w:val="22"/>
+          <w:lang w:eastAsia="en-US"/>
+        </w:rPr>
+        <w:t xml:space="preserve">. </w:t>
+      </w:r>
+      <w:r>
+        <w:rPr>
+          <w:rFonts w:asciiTheme="minorHAnsi" w:eastAsiaTheme="minorHAnsi" w:hAnsiTheme="minorHAnsi" w:cstheme="minorBidi"/>
+          <w:szCs w:val="22"/>
+          <w:lang w:eastAsia="en-US"/>
+        </w:rPr>
+        <w:t>Agregar addShadow(Shadow s) y getShadows() para registrar y exponer las sombras</w:t>
+      </w:r>
+      <w:r>
+        <w:rPr>
+          <w:rFonts w:asciiTheme="minorHAnsi" w:eastAsiaTheme="minorHAnsi" w:hAnsiTheme="minorHAnsi" w:cstheme="minorBidi"/>
+          <w:szCs w:val="22"/>
+          <w:lang w:eastAsia="en-US"/>
+        </w:rPr>
+        <w:t xml:space="preserve">. </w:t>
+      </w:r>
+      <w:r>
+        <w:rPr>
+          <w:rFonts w:asciiTheme="minorHAnsi" w:eastAsiaTheme="minorHAnsi" w:hAnsiTheme="minorHAnsi" w:cstheme="minorBidi"/>
+          <w:szCs w:val="22"/>
+          <w:lang w:eastAsia="en-US"/>
+        </w:rPr>
+        <w:t>En ticTac() iterar también sobre shadows</w:t>
+      </w:r>
+    </w:p>
+    <w:p>
+      <w:pPr>
+        <w:pStyle w:val="Prrafodelista"/>
+        <w:numPr>
+          <w:ilvl w:val="0"/>
+          <w:numId w:val="11"/>
+        </w:numPr>
+        <w:rPr>
+          <w:sz w:val="24"/>
+          <w:lang w:val="es-ES"/>
+        </w:rPr>
+      </w:pPr>
+      <w:r>
+        <w:rPr>
+          <w:sz w:val="24"/>
+          <w:lang w:val="es-ES"/>
+        </w:rPr>
+        <w:t>Diseñen, construyan y prueben esta nueva clase. (Mínimo dos pruebas de unidad)</w:t>
+      </w:r>
+    </w:p>
+    <w:p>
+      <w:pPr>
+        <w:rPr>
+          <w:sz w:val="24"/>
+          <w:lang w:val="es-ES"/>
+        </w:rPr>
+      </w:pPr>
+    </w:p>
+    <w:p>
+      <w:pPr>
+        <w:pStyle w:val="Prrafodelista"/>
+        <w:numPr>
+          <w:ilvl w:val="0"/>
+          <w:numId w:val="11"/>
+        </w:numPr>
+        <w:rPr>
+          <w:sz w:val="24"/>
+        </w:rPr>
+      </w:pPr>
+      <w:r>
+        <w:rPr>
+          <w:sz w:val="24"/>
+          <w:lang w:val="es-ES"/>
+        </w:rPr>
+        <w:t xml:space="preserve">Adicionen dos objetos sombras en Forest , llámenlos thief y lass , (a) ¿Cómo quedarían después de cuatro Tic-tac? Ejecuten el programa y hagan 7 clics en el botón. </w:t>
+      </w:r>
+      <w:r>
+        <w:rPr>
+          <w:sz w:val="24"/>
+        </w:rPr>
+        <w:t>Capturen una pantalla</w:t>
+      </w:r>
+      <w:r>
+        <w:rPr>
+          <w:sz w:val="24"/>
+        </w:rPr>
+        <w:t xml:space="preserve"> </w:t>
+      </w:r>
+      <w:r>
+        <w:rPr>
+          <w:sz w:val="24"/>
+        </w:rPr>
+        <w:t>significativa. (b) ¿Es correcto?</w:t>
+      </w:r>
+    </w:p>
+    <w:p>
+      <w:pPr>
+        <w:pStyle w:val="Prrafodelista"/>
+        <w:rPr>
+          <w:sz w:val="24"/>
+        </w:rPr>
+      </w:pPr>
+    </w:p>
+    <w:p>
+      <w:pPr>
+        <w:pStyle w:val="Prrafodelista"/>
+        <w:ind w:left="1080"/>
+        <w:rPr>
+          <w:sz w:val="24"/>
+          <w:lang w:val="es-ES"/>
+        </w:rPr>
+      </w:pPr>
+      <w:r>
+        <w:rPr>
+          <w:sz w:val="24"/>
+          <w:lang w:val="es-ES"/>
+        </w:rPr>
+        <w:t>Rta.b: Si, e</w:t>
+      </w:r>
+      <w:r>
+        <w:rPr>
+          <w:sz w:val="24"/>
+          <w:lang w:val="es-ES"/>
+        </w:rPr>
+        <w:t>s corregcto ya que no colisionan con las ardillas, y de la misma manera, avanzan de manera correcta.</w:t>
+      </w:r>
+    </w:p>
+    <w:p>
+      <w:pPr>
+        <w:pStyle w:val="Prrafodelista"/>
+        <w:rPr>
+          <w:sz w:val="24"/>
+          <w:lang w:val="es-ES"/>
+        </w:rPr>
+      </w:pPr>
+      <w:r>
+        <w:rPr>
+          <w:sz w:val="24"/>
+          <w:lang w:val="es-ES"/>
+        </w:rPr>
+        <w:t>4 clics:</w:t>
+      </w:r>
+    </w:p>
+    <w:p>
+      <w:pPr>
+        <w:pStyle w:val="Prrafodelista"/>
+        <w:rPr>
+          <w:sz w:val="24"/>
+        </w:rPr>
+      </w:pPr>
+      <w:r>
+        <w:rPr>
+          <w:sz w:val="24"/>
+        </w:rPr>
+        <w:drawing>
+          <wp:inline distT="0" distB="0" distL="0" distR="0" wp14:anchorId="6642036B" wp14:editId="129B8FC5">
+            <wp:extent cx="3649656" cy="4128868"/>
+            <wp:effectExtent l="0" t="0" r="8255" b="5080"/>
+            <wp:docPr id="3" name="Imagen 3"/>
+            <wp:cNvGraphicFramePr>
+              <a:graphicFrameLocks xmlns:a="http://schemas.openxmlformats.org/drawingml/2006/main" noChangeAspect="1"/>
+            </wp:cNvGraphicFramePr>
+            <a:graphic xmlns:a="http://schemas.openxmlformats.org/drawingml/2006/main">
+              <a:graphicData uri="http://schemas.openxmlformats.org/drawingml/2006/picture">
+                <pic:pic xmlns:pic="http://schemas.openxmlformats.org/drawingml/2006/picture">
+                  <pic:nvPicPr>
+                    <pic:cNvPr id="1" name=""/>
+                    <pic:cNvPicPr/>
+                  </pic:nvPicPr>
+                  <pic:blipFill>
+                    <a:blip r:embed="rId14"/>
+                    <a:stretch>
+                      <a:fillRect/>
+                    </a:stretch>
+                  </pic:blipFill>
+                  <pic:spPr>
+                    <a:xfrm>
+                      <a:off x="0" y="0"/>
+                      <a:ext cx="3656313" cy="4136399"/>
+                    </a:xfrm>
+                    <a:prstGeom prst="rect">
+                      <a:avLst/>
+                    </a:prstGeom>
+                  </pic:spPr>
+                </pic:pic>
+              </a:graphicData>
+            </a:graphic>
+          </wp:inline>
+        </w:drawing>
+      </w:r>
+    </w:p>
+    <w:p>
+      <w:pPr>
+        <w:pStyle w:val="Prrafodelista"/>
+        <w:rPr>
+          <w:sz w:val="24"/>
+        </w:rPr>
+      </w:pPr>
+    </w:p>
+    <w:p>
+      <w:pPr>
+        <w:pStyle w:val="Prrafodelista"/>
+        <w:rPr>
+          <w:sz w:val="24"/>
+        </w:rPr>
+      </w:pPr>
+    </w:p>
+    <w:p>
+      <w:pPr>
+        <w:pStyle w:val="Prrafodelista"/>
+        <w:rPr>
+          <w:sz w:val="24"/>
+        </w:rPr>
+      </w:pPr>
+    </w:p>
+    <w:p>
+      <w:pPr>
+        <w:pStyle w:val="Prrafodelista"/>
+        <w:rPr>
+          <w:sz w:val="24"/>
+        </w:rPr>
+      </w:pPr>
+    </w:p>
+    <w:p>
+      <w:pPr>
+        <w:pStyle w:val="Prrafodelista"/>
+        <w:rPr>
+          <w:sz w:val="24"/>
+        </w:rPr>
+      </w:pPr>
+    </w:p>
+    <w:p>
+      <w:pPr>
+        <w:pStyle w:val="Prrafodelista"/>
+        <w:rPr>
+          <w:sz w:val="24"/>
+        </w:rPr>
+      </w:pPr>
+    </w:p>
+    <w:p>
+      <w:pPr>
+        <w:pStyle w:val="Prrafodelista"/>
+        <w:rPr>
+          <w:sz w:val="24"/>
+        </w:rPr>
+      </w:pPr>
+      <w:r>
+        <w:rPr>
+          <w:sz w:val="24"/>
+        </w:rPr>
+        <w:t xml:space="preserve">7 clics despúes: </w:t>
+      </w:r>
+    </w:p>
+    <w:p>
+      <w:pPr>
+        <w:pStyle w:val="Prrafodelista"/>
+        <w:rPr>
+          <w:sz w:val="24"/>
+        </w:rPr>
+      </w:pPr>
+      <w:r>
+        <w:rPr>
+          <w:sz w:val="24"/>
+        </w:rPr>
+        <w:drawing>
+          <wp:inline distT="0" distB="0" distL="0" distR="0" wp14:anchorId="676DB112" wp14:editId="2CF87231">
+            <wp:extent cx="3489362" cy="3938953"/>
+            <wp:effectExtent l="0" t="0" r="0" b="4445"/>
+            <wp:docPr id="4" name="Imagen 4"/>
+            <wp:cNvGraphicFramePr>
+              <a:graphicFrameLocks xmlns:a="http://schemas.openxmlformats.org/drawingml/2006/main" noChangeAspect="1"/>
+            </wp:cNvGraphicFramePr>
+            <a:graphic xmlns:a="http://schemas.openxmlformats.org/drawingml/2006/main">
+              <a:graphicData uri="http://schemas.openxmlformats.org/drawingml/2006/picture">
+                <pic:pic xmlns:pic="http://schemas.openxmlformats.org/drawingml/2006/picture">
+                  <pic:nvPicPr>
+                    <pic:cNvPr id="1" name=""/>
+                    <pic:cNvPicPr/>
+                  </pic:nvPicPr>
+                  <pic:blipFill>
+                    <a:blip r:embed="rId15"/>
+                    <a:stretch>
+                      <a:fillRect/>
+                    </a:stretch>
+                  </pic:blipFill>
+                  <pic:spPr>
+                    <a:xfrm>
+                      <a:off x="0" y="0"/>
+                      <a:ext cx="3493657" cy="3943801"/>
+                    </a:xfrm>
+                    <a:prstGeom prst="rect">
+                      <a:avLst/>
+                    </a:prstGeom>
+                  </pic:spPr>
+                </pic:pic>
+              </a:graphicData>
+            </a:graphic>
+          </wp:inline>
+        </w:drawing>
+      </w:r>
+    </w:p>
+    <w:p>
+      <w:pPr>
+        <w:pStyle w:val="Prrafodelista"/>
+        <w:ind w:hanging="1429"/>
+        <w:rPr>
+          <w:sz w:val="24"/>
+        </w:rPr>
+      </w:pPr>
+    </w:p>
+    <w:p>
+      <w:pPr>
+        <w:rPr>
+          <w:sz w:val="24"/>
+          <w:lang w:val="es-ES"/>
+        </w:rPr>
+      </w:pPr>
+      <w:r>
+        <w:rPr>
+          <w:b/>
+          <w:bCs/>
+          <w:sz w:val="24"/>
+          <w:lang w:val="es-ES"/>
+        </w:rPr>
+        <w:t>D Ciclo 4. Proponiendo y diseñando : Nuevo árbol</w:t>
+      </w:r>
+      <w:r>
+        <w:rPr>
+          <w:sz w:val="24"/>
+          <w:lang w:val="es-ES"/>
+        </w:rPr>
+        <w:t xml:space="preserve"> </w:t>
+      </w:r>
+    </w:p>
+    <w:p>
+      <w:pPr>
+        <w:rPr>
+          <w:sz w:val="24"/>
+          <w:lang w:val="es-ES"/>
+        </w:rPr>
+      </w:pPr>
+      <w:r>
+        <w:rPr>
+          <w:sz w:val="24"/>
+          <w:lang w:val="es-ES"/>
+        </w:rPr>
+        <w:t>El objetivo de este punto es permitir recibir en un nuevo tipo de Tree.</w:t>
+      </w:r>
+    </w:p>
+    <w:p>
+      <w:pPr>
+        <w:rPr>
+          <w:sz w:val="24"/>
+          <w:lang w:val="es-ES"/>
+        </w:rPr>
+      </w:pPr>
+      <w:r>
+        <w:rPr>
+          <w:sz w:val="24"/>
+          <w:lang w:val="es-ES"/>
+        </w:rPr>
+        <w:t>1. Propongan, describan e implementen el nuevo tipo de Tree. (Mínimo dos pruebas de unidad)</w:t>
+      </w:r>
+    </w:p>
+    <w:p>
+      <w:pPr>
+        <w:rPr>
+          <w:sz w:val="24"/>
+          <w:lang w:val="es-ES"/>
+        </w:rPr>
+      </w:pPr>
+    </w:p>
+    <w:p>
+      <w:pPr>
+        <w:rPr>
+          <w:sz w:val="24"/>
+          <w:lang w:val="es-ES"/>
+        </w:rPr>
+      </w:pPr>
+      <w:r>
+        <w:rPr>
+          <w:sz w:val="24"/>
+          <w:lang w:val="es-ES"/>
+        </w:rPr>
+        <w:t>2. Considerando una pareja de ellos con el apellido de ustedes. (a) Piensen en otra prueba significativa y expliquen la intención. (b) Codifiquen la prueba de unidad correspondiente y capturen la</w:t>
+      </w:r>
+      <w:r>
+        <w:rPr>
+          <w:sz w:val="24"/>
+          <w:lang w:val="es-ES"/>
+        </w:rPr>
+        <w:t xml:space="preserve"> </w:t>
+      </w:r>
+      <w:r>
+        <w:rPr>
+          <w:sz w:val="24"/>
+          <w:lang w:val="es-ES"/>
+        </w:rPr>
+        <w:t>pantalla de resultados de ejecución de la prueba. (c) Ejecuten el programa con esa prueba como</w:t>
+      </w:r>
+      <w:r>
+        <w:rPr>
+          <w:sz w:val="24"/>
+          <w:lang w:val="es-ES"/>
+        </w:rPr>
+        <w:t xml:space="preserve"> </w:t>
+      </w:r>
+      <w:r>
+        <w:rPr>
+          <w:sz w:val="24"/>
+          <w:lang w:val="es-ES"/>
+        </w:rPr>
+        <w:t>prueba de aceptación y capturen las pantallas correspondientes.</w:t>
+      </w:r>
+    </w:p>
+    <w:p>
+      <w:pPr>
+        <w:rPr>
+          <w:sz w:val="24"/>
+          <w:lang w:val="es-ES"/>
+        </w:rPr>
+      </w:pPr>
+      <w:r>
+        <w:rPr>
+          <w:sz w:val="24"/>
+          <w:lang w:val="es-ES"/>
+        </w:rPr>
+        <w:t xml:space="preserve"> </w:t>
+      </w:r>
+    </w:p>
+    <w:p>
+      <w:pPr>
+        <w:rPr>
+          <w:lang w:val="es-ES"/>
+        </w:rPr>
+      </w:pPr>
+    </w:p>
     <w:sectPr>
       <w:pgSz w:w="12240" w:h="15840"/>
       <w:pgMar w:top="1440" w:right="1440" w:bottom="1440" w:left="1440" w:header="720" w:footer="720" w:gutter="0"/>
@@ -3188,7 +3959,7 @@
 </file>
 
 <file path=word/numbering.xml><?xml version="1.0" encoding="utf-8"?>
-<w:numbering xmlns:wpc="http://schemas.microsoft.com/office/word/2010/wordprocessingCanvas" xmlns:cx="http://schemas.microsoft.com/office/drawing/2014/chartex" xmlns:cx1="http://schemas.microsoft.com/office/drawing/2015/9/8/chartex" xmlns:cx2="http://schemas.microsoft.com/office/drawing/2015/10/21/chartex" xmlns:cx3="http://schemas.microsoft.com/office/drawing/2016/5/9/chartex" xmlns:cx4="http://schemas.microsoft.com/office/drawing/2016/5/10/chartex" xmlns:cx5="http://schemas.microsoft.com/office/drawing/2016/5/11/chartex" xmlns:cx6="http://schemas.microsoft.com/office/drawing/2016/5/12/chartex" xmlns:cx7="http://schemas.microsoft.com/office/drawing/2016/5/13/chartex" xmlns:cx8="http://schemas.microsoft.com/office/drawing/2016/5/14/chartex" xmlns:mc="http://schemas.openxmlformats.org/markup-compatibility/2006" xmlns:aink="http://schemas.microsoft.com/office/drawing/2016/ink" xmlns:am3d="http://schemas.microsoft.com/office/drawing/2017/model3d" xmlns:o="urn:schemas-microsoft-com:office:office" xmlns:oel="http://schemas.microsoft.com/office/2019/extlst" xmlns:r="http://schemas.openxmlformats.org/officeDocument/2006/relationships" xmlns:m="http://schemas.openxmlformats.org/officeDocument/2006/math" xmlns:v="urn:schemas-microsoft-com:vml" xmlns:wp14="http://schemas.microsoft.com/office/word/2010/wordprocessingDrawing" xmlns:wp="http://schemas.openxmlformats.org/drawingml/2006/wordprocessingDrawing" xmlns:w10="urn:schemas-microsoft-com:office:word" xmlns:w="http://schemas.openxmlformats.org/wordprocessingml/2006/main" xmlns:w14="http://schemas.microsoft.com/office/word/2010/wordml" xmlns:w15="http://schemas.microsoft.com/office/word/2012/wordml" xmlns:w16cex="http://schemas.microsoft.com/office/word/2018/wordml/cex" xmlns:w16cid="http://schemas.microsoft.com/office/word/2016/wordml/cid" xmlns:w16="http://schemas.microsoft.com/office/word/2018/wordml" xmlns:w16du="http://schemas.microsoft.com/office/word/2023/wordml/word16du" xmlns:w16sdtdh="http://schemas.microsoft.com/office/word/2020/wordml/sdtdatahash" xmlns:w16sdtfl="http://schemas.microsoft.com/office/word/2024/wordml/sdtformatlock" xmlns:w16se="http://schemas.microsoft.com/office/word/2015/wordml/symex" xmlns:wpg="http://schemas.microsoft.com/office/word/2010/wordprocessingGroup" xmlns:wpi="http://schemas.microsoft.com/office/word/2010/wordprocessingInk" xmlns:wne="http://schemas.microsoft.com/office/word/2006/wordml" xmlns:wps="http://schemas.microsoft.com/office/word/2010/wordprocessingShape" mc:Ignorable="w14 w15 w16se w16cid w16 w16cex w16sdtdh w16sdtfl w16du wp14">
+<w:numbering xmlns:wpc="http://schemas.microsoft.com/office/word/2010/wordprocessingCanvas" xmlns:cx="http://schemas.microsoft.com/office/drawing/2014/chartex" xmlns:cx1="http://schemas.microsoft.com/office/drawing/2015/9/8/chartex" xmlns:cx2="http://schemas.microsoft.com/office/drawing/2015/10/21/chartex" xmlns:cx3="http://schemas.microsoft.com/office/drawing/2016/5/9/chartex" xmlns:cx4="http://schemas.microsoft.com/office/drawing/2016/5/10/chartex" xmlns:cx5="http://schemas.microsoft.com/office/drawing/2016/5/11/chartex" xmlns:cx6="http://schemas.microsoft.com/office/drawing/2016/5/12/chartex" xmlns:cx7="http://schemas.microsoft.com/office/drawing/2016/5/13/chartex" xmlns:cx8="http://schemas.microsoft.com/office/drawing/2016/5/14/chartex" xmlns:mc="http://schemas.openxmlformats.org/markup-compatibility/2006" xmlns:aink="http://schemas.microsoft.com/office/drawing/2016/ink" xmlns:am3d="http://schemas.microsoft.com/office/drawing/2017/model3d" xmlns:o="urn:schemas-microsoft-com:office:office" xmlns:r="http://schemas.openxmlformats.org/officeDocument/2006/relationships" xmlns:m="http://schemas.openxmlformats.org/officeDocument/2006/math" xmlns:v="urn:schemas-microsoft-com:vml" xmlns:wp14="http://schemas.microsoft.com/office/word/2010/wordprocessingDrawing" xmlns:wp="http://schemas.openxmlformats.org/drawingml/2006/wordprocessingDrawing" xmlns:w10="urn:schemas-microsoft-com:office:word" xmlns:w="http://schemas.openxmlformats.org/wordprocessingml/2006/main" xmlns:w14="http://schemas.microsoft.com/office/word/2010/wordml" xmlns:w15="http://schemas.microsoft.com/office/word/2012/wordml" xmlns:w16cex="http://schemas.microsoft.com/office/word/2018/wordml/cex" xmlns:w16cid="http://schemas.microsoft.com/office/word/2016/wordml/cid" xmlns:w16="http://schemas.microsoft.com/office/word/2018/wordml" xmlns:w16sdtdh="http://schemas.microsoft.com/office/word/2020/wordml/sdtdatahash" xmlns:w16se="http://schemas.microsoft.com/office/word/2015/wordml/symex" xmlns:wpg="http://schemas.microsoft.com/office/word/2010/wordprocessingGroup" xmlns:wpi="http://schemas.microsoft.com/office/word/2010/wordprocessingInk" xmlns:wne="http://schemas.microsoft.com/office/word/2006/wordml" xmlns:wps="http://schemas.microsoft.com/office/word/2010/wordprocessingShape" mc:Ignorable="w14 w15 w16se w16cid w16 w16cex w16sdtdh wp14">
   <w:abstractNum w:abstractNumId="0" w15:restartNumberingAfterBreak="0">
     <w:nsid w:val="20B203F0"/>
     <w:multiLevelType w:val="hybridMultilevel"/>
@@ -3279,6 +4050,155 @@
     </w:lvl>
   </w:abstractNum>
   <w:abstractNum w:abstractNumId="1" w15:restartNumberingAfterBreak="0">
+    <w:nsid w:val="2C36457B"/>
+    <w:multiLevelType w:val="multilevel"/>
+    <w:tmpl w:val="8D266068"/>
+    <w:lvl w:ilvl="0">
+      <w:start w:val="1"/>
+      <w:numFmt w:val="bullet"/>
+      <w:lvlText w:val=""/>
+      <w:lvlJc w:val="left"/>
+      <w:pPr>
+        <w:tabs>
+          <w:tab w:val="num" w:pos="720"/>
+        </w:tabs>
+        <w:ind w:left="720" w:hanging="360"/>
+      </w:pPr>
+      <w:rPr>
+        <w:rFonts w:ascii="Symbol" w:hAnsi="Symbol" w:hint="default"/>
+        <w:sz w:val="20"/>
+      </w:rPr>
+    </w:lvl>
+    <w:lvl w:ilvl="1" w:tentative="1">
+      <w:start w:val="1"/>
+      <w:numFmt w:val="bullet"/>
+      <w:lvlText w:val="o"/>
+      <w:lvlJc w:val="left"/>
+      <w:pPr>
+        <w:tabs>
+          <w:tab w:val="num" w:pos="1440"/>
+        </w:tabs>
+        <w:ind w:left="1440" w:hanging="360"/>
+      </w:pPr>
+      <w:rPr>
+        <w:rFonts w:ascii="Courier New" w:hAnsi="Courier New" w:hint="default"/>
+        <w:sz w:val="20"/>
+      </w:rPr>
+    </w:lvl>
+    <w:lvl w:ilvl="2" w:tentative="1">
+      <w:start w:val="1"/>
+      <w:numFmt w:val="bullet"/>
+      <w:lvlText w:val=""/>
+      <w:lvlJc w:val="left"/>
+      <w:pPr>
+        <w:tabs>
+          <w:tab w:val="num" w:pos="2160"/>
+        </w:tabs>
+        <w:ind w:left="2160" w:hanging="360"/>
+      </w:pPr>
+      <w:rPr>
+        <w:rFonts w:ascii="Wingdings" w:hAnsi="Wingdings" w:hint="default"/>
+        <w:sz w:val="20"/>
+      </w:rPr>
+    </w:lvl>
+    <w:lvl w:ilvl="3" w:tentative="1">
+      <w:start w:val="1"/>
+      <w:numFmt w:val="bullet"/>
+      <w:lvlText w:val=""/>
+      <w:lvlJc w:val="left"/>
+      <w:pPr>
+        <w:tabs>
+          <w:tab w:val="num" w:pos="2880"/>
+        </w:tabs>
+        <w:ind w:left="2880" w:hanging="360"/>
+      </w:pPr>
+      <w:rPr>
+        <w:rFonts w:ascii="Wingdings" w:hAnsi="Wingdings" w:hint="default"/>
+        <w:sz w:val="20"/>
+      </w:rPr>
+    </w:lvl>
+    <w:lvl w:ilvl="4" w:tentative="1">
+      <w:start w:val="1"/>
+      <w:numFmt w:val="bullet"/>
+      <w:lvlText w:val=""/>
+      <w:lvlJc w:val="left"/>
+      <w:pPr>
+        <w:tabs>
+          <w:tab w:val="num" w:pos="3600"/>
+        </w:tabs>
+        <w:ind w:left="3600" w:hanging="360"/>
+      </w:pPr>
+      <w:rPr>
+        <w:rFonts w:ascii="Wingdings" w:hAnsi="Wingdings" w:hint="default"/>
+        <w:sz w:val="20"/>
+      </w:rPr>
+    </w:lvl>
+    <w:lvl w:ilvl="5" w:tentative="1">
+      <w:start w:val="1"/>
+      <w:numFmt w:val="bullet"/>
+      <w:lvlText w:val=""/>
+      <w:lvlJc w:val="left"/>
+      <w:pPr>
+        <w:tabs>
+          <w:tab w:val="num" w:pos="4320"/>
+        </w:tabs>
+        <w:ind w:left="4320" w:hanging="360"/>
+      </w:pPr>
+      <w:rPr>
+        <w:rFonts w:ascii="Wingdings" w:hAnsi="Wingdings" w:hint="default"/>
+        <w:sz w:val="20"/>
+      </w:rPr>
+    </w:lvl>
+    <w:lvl w:ilvl="6" w:tentative="1">
+      <w:start w:val="1"/>
+      <w:numFmt w:val="bullet"/>
+      <w:lvlText w:val=""/>
+      <w:lvlJc w:val="left"/>
+      <w:pPr>
+        <w:tabs>
+          <w:tab w:val="num" w:pos="5040"/>
+        </w:tabs>
+        <w:ind w:left="5040" w:hanging="360"/>
+      </w:pPr>
+      <w:rPr>
+        <w:rFonts w:ascii="Wingdings" w:hAnsi="Wingdings" w:hint="default"/>
+        <w:sz w:val="20"/>
+      </w:rPr>
+    </w:lvl>
+    <w:lvl w:ilvl="7" w:tentative="1">
+      <w:start w:val="1"/>
+      <w:numFmt w:val="bullet"/>
+      <w:lvlText w:val=""/>
+      <w:lvlJc w:val="left"/>
+      <w:pPr>
+        <w:tabs>
+          <w:tab w:val="num" w:pos="5760"/>
+        </w:tabs>
+        <w:ind w:left="5760" w:hanging="360"/>
+      </w:pPr>
+      <w:rPr>
+        <w:rFonts w:ascii="Wingdings" w:hAnsi="Wingdings" w:hint="default"/>
+        <w:sz w:val="20"/>
+      </w:rPr>
+    </w:lvl>
+    <w:lvl w:ilvl="8" w:tentative="1">
+      <w:start w:val="1"/>
+      <w:numFmt w:val="bullet"/>
+      <w:lvlText w:val=""/>
+      <w:lvlJc w:val="left"/>
+      <w:pPr>
+        <w:tabs>
+          <w:tab w:val="num" w:pos="6480"/>
+        </w:tabs>
+        <w:ind w:left="6480" w:hanging="360"/>
+      </w:pPr>
+      <w:rPr>
+        <w:rFonts w:ascii="Wingdings" w:hAnsi="Wingdings" w:hint="default"/>
+        <w:sz w:val="20"/>
+      </w:rPr>
+    </w:lvl>
+  </w:abstractNum>
+  <w:abstractNum w:abstractNumId="2" w15:restartNumberingAfterBreak="0">
     <w:nsid w:val="2D6C4E91"/>
     <w:multiLevelType w:val="hybridMultilevel"/>
     <w:tmpl w:val="FA844B94"/>
@@ -3369,7 +4289,7 @@
       </w:pPr>
     </w:lvl>
   </w:abstractNum>
-  <w:abstractNum w:abstractNumId="2" w15:restartNumberingAfterBreak="0">
+  <w:abstractNum w:abstractNumId="3" w15:restartNumberingAfterBreak="0">
     <w:nsid w:val="31C05C9C"/>
     <w:multiLevelType w:val="hybridMultilevel"/>
     <w:tmpl w:val="1318F8D8"/>
@@ -3458,7 +4378,7 @@
       </w:pPr>
     </w:lvl>
   </w:abstractNum>
-  <w:abstractNum w:abstractNumId="3" w15:restartNumberingAfterBreak="0">
+  <w:abstractNum w:abstractNumId="4" w15:restartNumberingAfterBreak="0">
     <w:nsid w:val="341E339F"/>
     <w:multiLevelType w:val="hybridMultilevel"/>
     <w:tmpl w:val="60D2ED2E"/>
@@ -3547,7 +4467,7 @@
       </w:pPr>
     </w:lvl>
   </w:abstractNum>
-  <w:abstractNum w:abstractNumId="4" w15:restartNumberingAfterBreak="0">
+  <w:abstractNum w:abstractNumId="5" w15:restartNumberingAfterBreak="0">
     <w:nsid w:val="3A323D1E"/>
     <w:multiLevelType w:val="multilevel"/>
     <w:tmpl w:val="DA548CB0"/>
@@ -3696,7 +4616,7 @@
       </w:rPr>
     </w:lvl>
   </w:abstractNum>
-  <w:abstractNum w:abstractNumId="5" w15:restartNumberingAfterBreak="0">
+  <w:abstractNum w:abstractNumId="6" w15:restartNumberingAfterBreak="0">
     <w:nsid w:val="43E4320A"/>
     <w:multiLevelType w:val="hybridMultilevel"/>
     <w:tmpl w:val="81C4B5AA"/>
@@ -3785,7 +4705,96 @@
       </w:pPr>
     </w:lvl>
   </w:abstractNum>
-  <w:abstractNum w:abstractNumId="6" w15:restartNumberingAfterBreak="0">
+  <w:abstractNum w:abstractNumId="7" w15:restartNumberingAfterBreak="0">
+    <w:nsid w:val="4D267FA7"/>
+    <w:multiLevelType w:val="hybridMultilevel"/>
+    <w:tmpl w:val="9D5C47E6"/>
+    <w:lvl w:ilvl="0" w:tplc="0C0A000F">
+      <w:start w:val="1"/>
+      <w:numFmt w:val="decimal"/>
+      <w:lvlText w:val="%1."/>
+      <w:lvlJc w:val="left"/>
+      <w:pPr>
+        <w:ind w:left="720" w:hanging="360"/>
+      </w:pPr>
+      <w:rPr>
+        <w:rFonts w:hint="default"/>
+      </w:rPr>
+    </w:lvl>
+    <w:lvl w:ilvl="1" w:tplc="0C0A0019" w:tentative="1">
+      <w:start w:val="1"/>
+      <w:numFmt w:val="lowerLetter"/>
+      <w:lvlText w:val="%2."/>
+      <w:lvlJc w:val="left"/>
+      <w:pPr>
+        <w:ind w:left="1440" w:hanging="360"/>
+      </w:pPr>
+    </w:lvl>
+    <w:lvl w:ilvl="2" w:tplc="0C0A001B" w:tentative="1">
+      <w:start w:val="1"/>
+      <w:numFmt w:val="lowerRoman"/>
+      <w:lvlText w:val="%3."/>
+      <w:lvlJc w:val="right"/>
+      <w:pPr>
+        <w:ind w:left="2160" w:hanging="180"/>
+      </w:pPr>
+    </w:lvl>
+    <w:lvl w:ilvl="3" w:tplc="0C0A000F" w:tentative="1">
+      <w:start w:val="1"/>
+      <w:numFmt w:val="decimal"/>
+      <w:lvlText w:val="%4."/>
+      <w:lvlJc w:val="left"/>
+      <w:pPr>
+        <w:ind w:left="2880" w:hanging="360"/>
+      </w:pPr>
+    </w:lvl>
+    <w:lvl w:ilvl="4" w:tplc="0C0A0019" w:tentative="1">
+      <w:start w:val="1"/>
+      <w:numFmt w:val="lowerLetter"/>
+      <w:lvlText w:val="%5."/>
+      <w:lvlJc w:val="left"/>
+      <w:pPr>
+        <w:ind w:left="3600" w:hanging="360"/>
+      </w:pPr>
+    </w:lvl>
+    <w:lvl w:ilvl="5" w:tplc="0C0A001B" w:tentative="1">
+      <w:start w:val="1"/>
+      <w:numFmt w:val="lowerRoman"/>
+      <w:lvlText w:val="%6."/>
+      <w:lvlJc w:val="right"/>
+      <w:pPr>
+        <w:ind w:left="4320" w:hanging="180"/>
+      </w:pPr>
+    </w:lvl>
+    <w:lvl w:ilvl="6" w:tplc="0C0A000F" w:tentative="1">
+      <w:start w:val="1"/>
+      <w:numFmt w:val="decimal"/>
+      <w:lvlText w:val="%7."/>
+      <w:lvlJc w:val="left"/>
+      <w:pPr>
+        <w:ind w:left="5040" w:hanging="360"/>
+      </w:pPr>
+    </w:lvl>
+    <w:lvl w:ilvl="7" w:tplc="0C0A0019" w:tentative="1">
+      <w:start w:val="1"/>
+      <w:numFmt w:val="lowerLetter"/>
+      <w:lvlText w:val="%8."/>
+      <w:lvlJc w:val="left"/>
+      <w:pPr>
+        <w:ind w:left="5760" w:hanging="360"/>
+      </w:pPr>
+    </w:lvl>
+    <w:lvl w:ilvl="8" w:tplc="0C0A001B" w:tentative="1">
+      <w:start w:val="1"/>
+      <w:numFmt w:val="lowerRoman"/>
+      <w:lvlText w:val="%9."/>
+      <w:lvlJc w:val="right"/>
+      <w:pPr>
+        <w:ind w:left="6480" w:hanging="180"/>
+      </w:pPr>
+    </w:lvl>
+  </w:abstractNum>
+  <w:abstractNum w:abstractNumId="8" w15:restartNumberingAfterBreak="0">
     <w:nsid w:val="5356403B"/>
     <w:multiLevelType w:val="hybridMultilevel"/>
     <w:tmpl w:val="6344C26E"/>
@@ -3874,7 +4883,96 @@
       </w:pPr>
     </w:lvl>
   </w:abstractNum>
-  <w:abstractNum w:abstractNumId="7" w15:restartNumberingAfterBreak="0">
+  <w:abstractNum w:abstractNumId="9" w15:restartNumberingAfterBreak="0">
+    <w:nsid w:val="54952DE6"/>
+    <w:multiLevelType w:val="hybridMultilevel"/>
+    <w:tmpl w:val="A8F0688C"/>
+    <w:lvl w:ilvl="0" w:tplc="19005364">
+      <w:start w:val="1"/>
+      <w:numFmt w:val="decimal"/>
+      <w:lvlText w:val="%1."/>
+      <w:lvlJc w:val="left"/>
+      <w:pPr>
+        <w:ind w:left="1080" w:hanging="360"/>
+      </w:pPr>
+      <w:rPr>
+        <w:rFonts w:hint="default"/>
+      </w:rPr>
+    </w:lvl>
+    <w:lvl w:ilvl="1" w:tplc="0C0A0019" w:tentative="1">
+      <w:start w:val="1"/>
+      <w:numFmt w:val="lowerLetter"/>
+      <w:lvlText w:val="%2."/>
+      <w:lvlJc w:val="left"/>
+      <w:pPr>
+        <w:ind w:left="1800" w:hanging="360"/>
+      </w:pPr>
+    </w:lvl>
+    <w:lvl w:ilvl="2" w:tplc="0C0A001B" w:tentative="1">
+      <w:start w:val="1"/>
+      <w:numFmt w:val="lowerRoman"/>
+      <w:lvlText w:val="%3."/>
+      <w:lvlJc w:val="right"/>
+      <w:pPr>
+        <w:ind w:left="2520" w:hanging="180"/>
+      </w:pPr>
+    </w:lvl>
+    <w:lvl w:ilvl="3" w:tplc="0C0A000F" w:tentative="1">
+      <w:start w:val="1"/>
+      <w:numFmt w:val="decimal"/>
+      <w:lvlText w:val="%4."/>
+      <w:lvlJc w:val="left"/>
+      <w:pPr>
+        <w:ind w:left="3240" w:hanging="360"/>
+      </w:pPr>
+    </w:lvl>
+    <w:lvl w:ilvl="4" w:tplc="0C0A0019" w:tentative="1">
+      <w:start w:val="1"/>
+      <w:numFmt w:val="lowerLetter"/>
+      <w:lvlText w:val="%5."/>
+      <w:lvlJc w:val="left"/>
+      <w:pPr>
+        <w:ind w:left="3960" w:hanging="360"/>
+      </w:pPr>
+    </w:lvl>
+    <w:lvl w:ilvl="5" w:tplc="0C0A001B" w:tentative="1">
+      <w:start w:val="1"/>
+      <w:numFmt w:val="lowerRoman"/>
+      <w:lvlText w:val="%6."/>
+      <w:lvlJc w:val="right"/>
+      <w:pPr>
+        <w:ind w:left="4680" w:hanging="180"/>
+      </w:pPr>
+    </w:lvl>
+    <w:lvl w:ilvl="6" w:tplc="0C0A000F" w:tentative="1">
+      <w:start w:val="1"/>
+      <w:numFmt w:val="decimal"/>
+      <w:lvlText w:val="%7."/>
+      <w:lvlJc w:val="left"/>
+      <w:pPr>
+        <w:ind w:left="5400" w:hanging="360"/>
+      </w:pPr>
+    </w:lvl>
+    <w:lvl w:ilvl="7" w:tplc="0C0A0019" w:tentative="1">
+      <w:start w:val="1"/>
+      <w:numFmt w:val="lowerLetter"/>
+      <w:lvlText w:val="%8."/>
+      <w:lvlJc w:val="left"/>
+      <w:pPr>
+        <w:ind w:left="6120" w:hanging="360"/>
+      </w:pPr>
+    </w:lvl>
+    <w:lvl w:ilvl="8" w:tplc="0C0A001B" w:tentative="1">
+      <w:start w:val="1"/>
+      <w:numFmt w:val="lowerRoman"/>
+      <w:lvlText w:val="%9."/>
+      <w:lvlJc w:val="right"/>
+      <w:pPr>
+        <w:ind w:left="6840" w:hanging="180"/>
+      </w:pPr>
+    </w:lvl>
+  </w:abstractNum>
+  <w:abstractNum w:abstractNumId="10" w15:restartNumberingAfterBreak="0">
     <w:nsid w:val="618916F0"/>
     <w:multiLevelType w:val="hybridMultilevel"/>
     <w:tmpl w:val="AA2284A6"/>
@@ -3963,7 +5061,7 @@
       </w:pPr>
     </w:lvl>
   </w:abstractNum>
-  <w:abstractNum w:abstractNumId="8" w15:restartNumberingAfterBreak="0">
+  <w:abstractNum w:abstractNumId="11" w15:restartNumberingAfterBreak="0">
     <w:nsid w:val="639D45EC"/>
     <w:multiLevelType w:val="hybridMultilevel"/>
     <w:tmpl w:val="A74C8404"/>
@@ -4052,38 +5150,47 @@
       </w:pPr>
     </w:lvl>
   </w:abstractNum>
-  <w:num w:numId="1" w16cid:durableId="1202477363">
+  <w:num w:numId="1">
+    <w:abstractNumId w:val="6"/>
+  </w:num>
+  <w:num w:numId="2">
+    <w:abstractNumId w:val="10"/>
+  </w:num>
+  <w:num w:numId="3">
+    <w:abstractNumId w:val="2"/>
+  </w:num>
+  <w:num w:numId="4">
+    <w:abstractNumId w:val="3"/>
+  </w:num>
+  <w:num w:numId="5">
+    <w:abstractNumId w:val="4"/>
+  </w:num>
+  <w:num w:numId="6">
+    <w:abstractNumId w:val="0"/>
+  </w:num>
+  <w:num w:numId="7">
+    <w:abstractNumId w:val="8"/>
+  </w:num>
+  <w:num w:numId="8">
+    <w:abstractNumId w:val="11"/>
+  </w:num>
+  <w:num w:numId="9">
     <w:abstractNumId w:val="5"/>
   </w:num>
-  <w:num w:numId="2" w16cid:durableId="210315113">
+  <w:num w:numId="10">
     <w:abstractNumId w:val="7"/>
   </w:num>
-  <w:num w:numId="3" w16cid:durableId="1628202911">
+  <w:num w:numId="11">
+    <w:abstractNumId w:val="9"/>
+  </w:num>
+  <w:num w:numId="12">
     <w:abstractNumId w:val="1"/>
-  </w:num>
-  <w:num w:numId="4" w16cid:durableId="1412193756">
-    <w:abstractNumId w:val="2"/>
-  </w:num>
-  <w:num w:numId="5" w16cid:durableId="390541817">
-    <w:abstractNumId w:val="3"/>
-  </w:num>
-  <w:num w:numId="6" w16cid:durableId="81800302">
-    <w:abstractNumId w:val="0"/>
-  </w:num>
-  <w:num w:numId="7" w16cid:durableId="1418668310">
-    <w:abstractNumId w:val="6"/>
-  </w:num>
-  <w:num w:numId="8" w16cid:durableId="1716806580">
-    <w:abstractNumId w:val="8"/>
-  </w:num>
-  <w:num w:numId="9" w16cid:durableId="1655143076">
-    <w:abstractNumId w:val="4"/>
   </w:num>
 </w:numbering>
 </file>
 
 <file path=word/styles.xml><?xml version="1.0" encoding="utf-8"?>
-<w:styles xmlns:mc="http://schemas.openxmlformats.org/markup-compatibility/2006" xmlns:r="http://schemas.openxmlformats.org/officeDocument/2006/relationships" xmlns:w="http://schemas.openxmlformats.org/wordprocessingml/2006/main" xmlns:w14="http://schemas.microsoft.com/office/word/2010/wordml" xmlns:w15="http://schemas.microsoft.com/office/word/2012/wordml" xmlns:w16cex="http://schemas.microsoft.com/office/word/2018/wordml/cex" xmlns:w16cid="http://schemas.microsoft.com/office/word/2016/wordml/cid" xmlns:w16="http://schemas.microsoft.com/office/word/2018/wordml" xmlns:w16du="http://schemas.microsoft.com/office/word/2023/wordml/word16du" xmlns:w16sdtdh="http://schemas.microsoft.com/office/word/2020/wordml/sdtdatahash" xmlns:w16sdtfl="http://schemas.microsoft.com/office/word/2024/wordml/sdtformatlock" xmlns:w16se="http://schemas.microsoft.com/office/word/2015/wordml/symex" mc:Ignorable="w14 w15 w16se w16cid w16 w16cex w16sdtdh w16sdtfl w16du">
+<w:styles xmlns:mc="http://schemas.openxmlformats.org/markup-compatibility/2006" xmlns:r="http://schemas.openxmlformats.org/officeDocument/2006/relationships" xmlns:w="http://schemas.openxmlformats.org/wordprocessingml/2006/main" xmlns:w14="http://schemas.microsoft.com/office/word/2010/wordml" xmlns:w15="http://schemas.microsoft.com/office/word/2012/wordml" xmlns:w16cex="http://schemas.microsoft.com/office/word/2018/wordml/cex" xmlns:w16cid="http://schemas.microsoft.com/office/word/2016/wordml/cid" xmlns:w16="http://schemas.microsoft.com/office/word/2018/wordml" xmlns:w16sdtdh="http://schemas.microsoft.com/office/word/2020/wordml/sdtdatahash" xmlns:w16se="http://schemas.microsoft.com/office/word/2015/wordml/symex" mc:Ignorable="w14 w15 w16se w16cid w16 w16cex w16sdtdh">
   <w:docDefaults>
     <w:rPrDefault>
       <w:rPr>
@@ -4485,6 +5592,7 @@
   <w:style w:type="character" w:default="1" w:styleId="Fuentedeprrafopredeter">
     <w:name w:val="Default Paragraph Font"/>
     <w:uiPriority w:val="1"/>
+    <w:semiHidden/>
     <w:unhideWhenUsed/>
   </w:style>
   <w:style w:type="table" w:default="1" w:styleId="Tablanormal">
@@ -4628,6 +5736,47 @@
       <w:rFonts w:ascii="Times New Roman" w:hAnsi="Times New Roman" w:cs="Times New Roman"/>
       <w:sz w:val="24"/>
       <w:szCs w:val="24"/>
+    </w:rPr>
+  </w:style>
+  <w:style w:type="paragraph" w:customStyle="1" w:styleId="font-claude-response-body">
+    <w:name w:val="font-claude-response-body"/>
+    <w:basedOn w:val="Normal"/>
+    <w:rsid w:val="005C6667"/>
+    <w:pPr>
+      <w:spacing w:before="100" w:beforeAutospacing="1" w:after="100" w:afterAutospacing="1" w:line="240" w:lineRule="auto"/>
+    </w:pPr>
+    <w:rPr>
+      <w:rFonts w:ascii="Times New Roman" w:eastAsia="Times New Roman" w:hAnsi="Times New Roman" w:cs="Times New Roman"/>
+      <w:sz w:val="24"/>
+      <w:szCs w:val="24"/>
+      <w:lang w:val="es-ES" w:eastAsia="es-ES"/>
+    </w:rPr>
+  </w:style>
+  <w:style w:type="paragraph" w:customStyle="1" w:styleId="whitespace-normal">
+    <w:name w:val="whitespace-normal"/>
+    <w:basedOn w:val="Normal"/>
+    <w:rsid w:val="005C6667"/>
+    <w:pPr>
+      <w:spacing w:before="100" w:beforeAutospacing="1" w:after="100" w:afterAutospacing="1" w:line="240" w:lineRule="auto"/>
+    </w:pPr>
+    <w:rPr>
+      <w:rFonts w:ascii="Times New Roman" w:eastAsia="Times New Roman" w:hAnsi="Times New Roman" w:cs="Times New Roman"/>
+      <w:sz w:val="24"/>
+      <w:szCs w:val="24"/>
+      <w:lang w:val="es-ES" w:eastAsia="es-ES"/>
+    </w:rPr>
+  </w:style>
+  <w:style w:type="character" w:styleId="CdigoHTML">
+    <w:name w:val="HTML Code"/>
+    <w:basedOn w:val="Fuentedeprrafopredeter"/>
+    <w:uiPriority w:val="99"/>
+    <w:semiHidden/>
+    <w:unhideWhenUsed/>
+    <w:rsid w:val="005C6667"/>
+    <w:rPr>
+      <w:rFonts w:ascii="Courier New" w:eastAsia="Times New Roman" w:hAnsi="Courier New" w:cs="Courier New"/>
+      <w:sz w:val="20"/>
+      <w:szCs w:val="20"/>
     </w:rPr>
   </w:style>
 </w:styles>

</xml_diff>